<commit_message>
Update Ddeme Novelty Notes for Algorithm.docx
</commit_message>
<xml_diff>
--- a/Ddeme Novelty Notes for Algorithm.docx
+++ b/Ddeme Novelty Notes for Algorithm.docx
@@ -13,6 +13,1208 @@
     </w:p>
     <w:p>
       <w:pPr>
+        <w:pStyle w:val="BodyText"/>
+        <w:rPr>
+          <w:rFonts w:eastAsiaTheme="minorEastAsia"/>
+        </w:rPr>
+      </w:pPr>
+      <w:r>
+        <w:rPr>
+          <w:highlight w:val="yellow"/>
+        </w:rPr>
+        <w:t>Mention “entropic resistance” when discussing the variance awareness of the learning rate gradient</w:t>
+      </w:r>
+      <w:r>
+        <w:rPr>
+          <w:highlight w:val="yellow"/>
+        </w:rPr>
+        <w:t xml:space="preserve">, whereby </w:t>
+      </w:r>
+      <m:oMath>
+        <m:f>
+          <m:fPr>
+            <m:ctrlPr>
+              <w:rPr>
+                <w:rFonts w:ascii="Cambria Math" w:hAnsi="Cambria Math"/>
+                <w:highlight w:val="yellow"/>
+              </w:rPr>
+            </m:ctrlPr>
+          </m:fPr>
+          <m:num>
+            <m:sSup>
+              <m:sSupPr>
+                <m:ctrlPr>
+                  <w:rPr>
+                    <w:rFonts w:ascii="Cambria Math" w:hAnsi="Cambria Math"/>
+                    <w:i/>
+                    <w:highlight w:val="yellow"/>
+                  </w:rPr>
+                </m:ctrlPr>
+              </m:sSupPr>
+              <m:e>
+                <m:r>
+                  <w:rPr>
+                    <w:rFonts w:ascii="Cambria Math" w:hAnsi="Cambria Math"/>
+                    <w:highlight w:val="yellow"/>
+                  </w:rPr>
+                  <m:t>s</m:t>
+                </m:r>
+              </m:e>
+              <m:sup>
+                <m:r>
+                  <w:rPr>
+                    <w:rFonts w:ascii="Cambria Math" w:hAnsi="Cambria Math"/>
+                    <w:highlight w:val="yellow"/>
+                  </w:rPr>
+                  <m:t>2</m:t>
+                </m:r>
+              </m:sup>
+            </m:sSup>
+            <m:ctrlPr>
+              <w:rPr>
+                <w:rFonts w:ascii="Cambria Math" w:hAnsi="Cambria Math"/>
+                <w:i/>
+                <w:highlight w:val="yellow"/>
+              </w:rPr>
+            </m:ctrlPr>
+          </m:num>
+          <m:den>
+            <m:r>
+              <w:rPr>
+                <w:rFonts w:ascii="Cambria Math" w:hAnsi="Cambria Math"/>
+                <w:highlight w:val="yellow"/>
+              </w:rPr>
+              <m:t>dα</m:t>
+            </m:r>
+            <m:ctrlPr>
+              <w:rPr>
+                <w:rFonts w:ascii="Cambria Math" w:hAnsi="Cambria Math"/>
+                <w:i/>
+                <w:highlight w:val="yellow"/>
+              </w:rPr>
+            </m:ctrlPr>
+          </m:den>
+        </m:f>
+      </m:oMath>
+      <w:r>
+        <w:rPr>
+          <w:rFonts w:eastAsiaTheme="minorEastAsia"/>
+          <w:highlight w:val="yellow"/>
+        </w:rPr>
+        <w:t xml:space="preserve"> acts as a restoring force to move the system towards low noise conditions when the equation plateaus (</w:t>
+      </w:r>
+      <m:oMath>
+        <m:f>
+          <m:fPr>
+            <m:ctrlPr>
+              <w:rPr>
+                <w:rFonts w:ascii="Cambria Math" w:eastAsiaTheme="minorEastAsia" w:hAnsi="Cambria Math"/>
+                <w:i/>
+                <w:highlight w:val="yellow"/>
+              </w:rPr>
+            </m:ctrlPr>
+          </m:fPr>
+          <m:num>
+            <m:r>
+              <w:rPr>
+                <w:rFonts w:ascii="Cambria Math" w:eastAsiaTheme="minorEastAsia" w:hAnsi="Cambria Math"/>
+                <w:highlight w:val="yellow"/>
+              </w:rPr>
+              <m:t>dμ</m:t>
+            </m:r>
+          </m:num>
+          <m:den>
+            <m:r>
+              <w:rPr>
+                <w:rFonts w:ascii="Cambria Math" w:eastAsiaTheme="minorEastAsia" w:hAnsi="Cambria Math"/>
+                <w:highlight w:val="yellow"/>
+              </w:rPr>
+              <m:t>dα</m:t>
+            </m:r>
+          </m:den>
+        </m:f>
+        <m:r>
+          <w:rPr>
+            <w:rFonts w:ascii="Cambria Math" w:eastAsiaTheme="minorEastAsia" w:hAnsi="Cambria Math"/>
+            <w:highlight w:val="yellow"/>
+          </w:rPr>
+          <m:t xml:space="preserve">=0 → </m:t>
+        </m:r>
+        <m:f>
+          <m:fPr>
+            <m:ctrlPr>
+              <w:rPr>
+                <w:rFonts w:ascii="Cambria Math" w:eastAsiaTheme="minorEastAsia" w:hAnsi="Cambria Math"/>
+                <w:i/>
+                <w:highlight w:val="yellow"/>
+              </w:rPr>
+            </m:ctrlPr>
+          </m:fPr>
+          <m:num>
+            <m:r>
+              <w:rPr>
+                <w:rFonts w:ascii="Cambria Math" w:eastAsiaTheme="minorEastAsia" w:hAnsi="Cambria Math"/>
+                <w:highlight w:val="yellow"/>
+              </w:rPr>
+              <m:t>dL</m:t>
+            </m:r>
+          </m:num>
+          <m:den>
+            <m:r>
+              <w:rPr>
+                <w:rFonts w:ascii="Cambria Math" w:eastAsiaTheme="minorEastAsia" w:hAnsi="Cambria Math"/>
+                <w:highlight w:val="yellow"/>
+              </w:rPr>
+              <m:t>dα</m:t>
+            </m:r>
+          </m:den>
+        </m:f>
+        <m:r>
+          <w:rPr>
+            <w:rFonts w:ascii="Cambria Math" w:eastAsiaTheme="minorEastAsia" w:hAnsi="Cambria Math"/>
+            <w:highlight w:val="yellow"/>
+          </w:rPr>
+          <m:t>=λ</m:t>
+        </m:r>
+        <m:f>
+          <m:fPr>
+            <m:ctrlPr>
+              <w:rPr>
+                <w:rFonts w:ascii="Cambria Math" w:hAnsi="Cambria Math"/>
+                <w:highlight w:val="yellow"/>
+              </w:rPr>
+            </m:ctrlPr>
+          </m:fPr>
+          <m:num>
+            <m:sSup>
+              <m:sSupPr>
+                <m:ctrlPr>
+                  <w:rPr>
+                    <w:rFonts w:ascii="Cambria Math" w:hAnsi="Cambria Math"/>
+                    <w:i/>
+                    <w:highlight w:val="yellow"/>
+                  </w:rPr>
+                </m:ctrlPr>
+              </m:sSupPr>
+              <m:e>
+                <m:r>
+                  <w:rPr>
+                    <w:rFonts w:ascii="Cambria Math" w:hAnsi="Cambria Math"/>
+                    <w:highlight w:val="yellow"/>
+                  </w:rPr>
+                  <m:t>s</m:t>
+                </m:r>
+              </m:e>
+              <m:sup>
+                <m:r>
+                  <w:rPr>
+                    <w:rFonts w:ascii="Cambria Math" w:hAnsi="Cambria Math"/>
+                    <w:highlight w:val="yellow"/>
+                  </w:rPr>
+                  <m:t>2</m:t>
+                </m:r>
+              </m:sup>
+            </m:sSup>
+            <m:ctrlPr>
+              <w:rPr>
+                <w:rFonts w:ascii="Cambria Math" w:hAnsi="Cambria Math"/>
+                <w:i/>
+                <w:highlight w:val="yellow"/>
+              </w:rPr>
+            </m:ctrlPr>
+          </m:num>
+          <m:den>
+            <m:r>
+              <w:rPr>
+                <w:rFonts w:ascii="Cambria Math" w:hAnsi="Cambria Math"/>
+                <w:highlight w:val="yellow"/>
+              </w:rPr>
+              <m:t>dα</m:t>
+            </m:r>
+            <m:ctrlPr>
+              <w:rPr>
+                <w:rFonts w:ascii="Cambria Math" w:hAnsi="Cambria Math"/>
+                <w:i/>
+                <w:highlight w:val="yellow"/>
+              </w:rPr>
+            </m:ctrlPr>
+          </m:den>
+        </m:f>
+      </m:oMath>
+      <w:r>
+        <w:rPr>
+          <w:rFonts w:eastAsiaTheme="minorEastAsia"/>
+          <w:highlight w:val="yellow"/>
+        </w:rPr>
+        <w:t>)</w:t>
+      </w:r>
+      <w:r>
+        <w:rPr>
+          <w:rFonts w:eastAsiaTheme="minorEastAsia"/>
+          <w:highlight w:val="yellow"/>
+        </w:rPr>
+        <w:t xml:space="preserve">. </w:t>
+      </w:r>
+      <w:r>
+        <w:rPr>
+          <w:rFonts w:eastAsiaTheme="minorEastAsia"/>
+          <w:highlight w:val="yellow"/>
+        </w:rPr>
+        <w:t xml:space="preserve">If </w:t>
+      </w:r>
+      <m:oMath>
+        <m:sSub>
+          <m:sSubPr>
+            <m:ctrlPr>
+              <w:rPr>
+                <w:rFonts w:ascii="Cambria Math" w:eastAsiaTheme="minorEastAsia" w:hAnsi="Cambria Math"/>
+                <w:i/>
+                <w:highlight w:val="yellow"/>
+              </w:rPr>
+            </m:ctrlPr>
+          </m:sSubPr>
+          <m:e>
+            <m:r>
+              <w:rPr>
+                <w:rFonts w:ascii="Cambria Math" w:eastAsiaTheme="minorEastAsia" w:hAnsi="Cambria Math"/>
+                <w:highlight w:val="yellow"/>
+              </w:rPr>
+              <m:t>v</m:t>
+            </m:r>
+          </m:e>
+          <m:sub>
+            <m:r>
+              <w:rPr>
+                <w:rFonts w:ascii="Cambria Math" w:eastAsiaTheme="minorEastAsia" w:hAnsi="Cambria Math"/>
+                <w:highlight w:val="yellow"/>
+              </w:rPr>
+              <m:t>d</m:t>
+            </m:r>
+          </m:sub>
+        </m:sSub>
+      </m:oMath>
+      <w:r>
+        <w:rPr>
+          <w:rFonts w:eastAsiaTheme="minorEastAsia"/>
+          <w:highlight w:val="yellow"/>
+        </w:rPr>
+        <w:t xml:space="preserve"> is located at the plateau, t</w:t>
+      </w:r>
+      <w:r>
+        <w:rPr>
+          <w:rFonts w:eastAsiaTheme="minorEastAsia"/>
+          <w:highlight w:val="yellow"/>
+        </w:rPr>
+        <w:t xml:space="preserve">his </w:t>
+      </w:r>
+      <w:r>
+        <w:rPr>
+          <w:rFonts w:eastAsiaTheme="minorEastAsia"/>
+          <w:highlight w:val="yellow"/>
+        </w:rPr>
+        <w:t>can be</w:t>
+      </w:r>
+      <w:r>
+        <w:rPr>
+          <w:rFonts w:eastAsiaTheme="minorEastAsia"/>
+          <w:highlight w:val="yellow"/>
+        </w:rPr>
+        <w:t xml:space="preserve"> analogous to moving </w:t>
+      </w:r>
+      <w:r>
+        <w:rPr>
+          <w:rFonts w:eastAsiaTheme="minorEastAsia"/>
+          <w:highlight w:val="yellow"/>
+        </w:rPr>
+        <w:t xml:space="preserve">the thermodynamic free energy of a system </w:t>
+      </w:r>
+      <w:r>
+        <w:rPr>
+          <w:rFonts w:eastAsiaTheme="minorEastAsia"/>
+          <w:highlight w:val="yellow"/>
+        </w:rPr>
+        <w:t>towards a</w:t>
+      </w:r>
+      <w:r>
+        <w:rPr>
+          <w:rFonts w:eastAsiaTheme="minorEastAsia"/>
+          <w:highlight w:val="yellow"/>
+        </w:rPr>
+        <w:t>n isothermal</w:t>
+      </w:r>
+      <w:r>
+        <w:rPr>
+          <w:rFonts w:eastAsiaTheme="minorEastAsia"/>
+          <w:highlight w:val="yellow"/>
+        </w:rPr>
+        <w:t xml:space="preserve"> stable edge whereby </w:t>
+      </w:r>
+      <m:oMath>
+        <m:r>
+          <w:rPr>
+            <w:rFonts w:ascii="Cambria Math" w:eastAsiaTheme="minorEastAsia" w:hAnsi="Cambria Math"/>
+            <w:highlight w:val="yellow"/>
+          </w:rPr>
+          <m:t>μ≈</m:t>
+        </m:r>
+        <m:sSub>
+          <m:sSubPr>
+            <m:ctrlPr>
+              <w:rPr>
+                <w:rFonts w:ascii="Cambria Math" w:eastAsiaTheme="minorEastAsia" w:hAnsi="Cambria Math"/>
+                <w:i/>
+                <w:highlight w:val="yellow"/>
+              </w:rPr>
+            </m:ctrlPr>
+          </m:sSubPr>
+          <m:e>
+            <m:r>
+              <w:rPr>
+                <w:rFonts w:ascii="Cambria Math" w:eastAsiaTheme="minorEastAsia" w:hAnsi="Cambria Math"/>
+                <w:highlight w:val="yellow"/>
+              </w:rPr>
+              <m:t>v</m:t>
+            </m:r>
+          </m:e>
+          <m:sub>
+            <m:r>
+              <w:rPr>
+                <w:rFonts w:ascii="Cambria Math" w:eastAsiaTheme="minorEastAsia" w:hAnsi="Cambria Math"/>
+                <w:highlight w:val="yellow"/>
+              </w:rPr>
+              <m:t>d</m:t>
+            </m:r>
+          </m:sub>
+        </m:sSub>
+      </m:oMath>
+      <w:r>
+        <w:rPr>
+          <w:rFonts w:eastAsiaTheme="minorEastAsia"/>
+          <w:highlight w:val="yellow"/>
+        </w:rPr>
+        <w:t xml:space="preserve"> </w:t>
+      </w:r>
+      <w:r>
+        <w:rPr>
+          <w:rFonts w:eastAsiaTheme="minorEastAsia"/>
+          <w:highlight w:val="yellow"/>
+        </w:rPr>
+        <w:t xml:space="preserve">(i.e. the </w:t>
+      </w:r>
+      <w:r>
+        <w:rPr>
+          <w:rFonts w:eastAsiaTheme="minorEastAsia"/>
+          <w:highlight w:val="yellow"/>
+        </w:rPr>
+        <w:t>internal energy</w:t>
+      </w:r>
+      <w:r>
+        <w:rPr>
+          <w:rFonts w:eastAsiaTheme="minorEastAsia"/>
+          <w:highlight w:val="yellow"/>
+        </w:rPr>
+        <w:t xml:space="preserve">), </w:t>
+      </w:r>
+      <w:r>
+        <w:rPr>
+          <w:rFonts w:eastAsiaTheme="minorEastAsia"/>
+          <w:highlight w:val="yellow"/>
+        </w:rPr>
+        <w:t xml:space="preserve">and </w:t>
+      </w:r>
+      <m:oMath>
+        <m:f>
+          <m:fPr>
+            <m:ctrlPr>
+              <w:rPr>
+                <w:rFonts w:ascii="Cambria Math" w:hAnsi="Cambria Math"/>
+                <w:highlight w:val="yellow"/>
+              </w:rPr>
+            </m:ctrlPr>
+          </m:fPr>
+          <m:num>
+            <m:sSup>
+              <m:sSupPr>
+                <m:ctrlPr>
+                  <w:rPr>
+                    <w:rFonts w:ascii="Cambria Math" w:hAnsi="Cambria Math"/>
+                    <w:i/>
+                    <w:highlight w:val="yellow"/>
+                  </w:rPr>
+                </m:ctrlPr>
+              </m:sSupPr>
+              <m:e>
+                <m:r>
+                  <w:rPr>
+                    <w:rFonts w:ascii="Cambria Math" w:hAnsi="Cambria Math"/>
+                    <w:highlight w:val="yellow"/>
+                  </w:rPr>
+                  <m:t>s</m:t>
+                </m:r>
+              </m:e>
+              <m:sup>
+                <m:r>
+                  <w:rPr>
+                    <w:rFonts w:ascii="Cambria Math" w:hAnsi="Cambria Math"/>
+                    <w:highlight w:val="yellow"/>
+                  </w:rPr>
+                  <m:t>2</m:t>
+                </m:r>
+              </m:sup>
+            </m:sSup>
+            <m:ctrlPr>
+              <w:rPr>
+                <w:rFonts w:ascii="Cambria Math" w:hAnsi="Cambria Math"/>
+                <w:i/>
+                <w:highlight w:val="yellow"/>
+              </w:rPr>
+            </m:ctrlPr>
+          </m:num>
+          <m:den>
+            <m:r>
+              <w:rPr>
+                <w:rFonts w:ascii="Cambria Math" w:hAnsi="Cambria Math"/>
+                <w:highlight w:val="yellow"/>
+              </w:rPr>
+              <m:t>dα</m:t>
+            </m:r>
+            <m:ctrlPr>
+              <w:rPr>
+                <w:rFonts w:ascii="Cambria Math" w:hAnsi="Cambria Math"/>
+                <w:i/>
+                <w:highlight w:val="yellow"/>
+              </w:rPr>
+            </m:ctrlPr>
+          </m:den>
+        </m:f>
+      </m:oMath>
+      <w:r>
+        <w:rPr>
+          <w:rFonts w:eastAsiaTheme="minorEastAsia"/>
+          <w:highlight w:val="yellow"/>
+        </w:rPr>
+        <w:t xml:space="preserve"> acts as a heat flow indicator to move the system towards </w:t>
+      </w:r>
+      <w:r>
+        <w:rPr>
+          <w:rFonts w:eastAsiaTheme="minorEastAsia"/>
+          <w:highlight w:val="yellow"/>
+        </w:rPr>
+        <w:t xml:space="preserve">the most stable </w:t>
+      </w:r>
+      <w:r>
+        <w:rPr>
+          <w:rFonts w:eastAsiaTheme="minorEastAsia"/>
+          <w:highlight w:val="yellow"/>
+        </w:rPr>
+        <w:t>equilibrium</w:t>
+      </w:r>
+      <w:r>
+        <w:rPr>
+          <w:rFonts w:eastAsiaTheme="minorEastAsia"/>
+          <w:highlight w:val="yellow"/>
+        </w:rPr>
+        <w:t xml:space="preserve"> (i.e. minimize entropy).</w:t>
+      </w:r>
+    </w:p>
+    <w:p>
+      <w:pPr>
+        <w:pStyle w:val="BodyText"/>
+        <w:rPr>
+          <w:rFonts w:eastAsiaTheme="minorEastAsia"/>
+        </w:rPr>
+      </w:pPr>
+      <m:oMathPara>
+        <m:oMath>
+          <m:borderBox>
+            <m:borderBoxPr>
+              <m:ctrlPr>
+                <w:rPr>
+                  <w:rFonts w:ascii="Cambria Math" w:eastAsiaTheme="minorEastAsia" w:hAnsi="Cambria Math"/>
+                  <w:i/>
+                </w:rPr>
+              </m:ctrlPr>
+            </m:borderBoxPr>
+            <m:e>
+              <m:f>
+                <m:fPr>
+                  <m:ctrlPr>
+                    <w:rPr>
+                      <w:rFonts w:ascii="Cambria Math" w:eastAsiaTheme="minorEastAsia" w:hAnsi="Cambria Math"/>
+                    </w:rPr>
+                  </m:ctrlPr>
+                </m:fPr>
+                <m:num>
+                  <m:r>
+                    <w:rPr>
+                      <w:rFonts w:ascii="Cambria Math" w:eastAsiaTheme="minorEastAsia" w:hAnsi="Cambria Math"/>
+                    </w:rPr>
+                    <m:t>d</m:t>
+                  </m:r>
+                  <m:r>
+                    <w:rPr>
+                      <w:rFonts w:ascii="Cambria Math" w:eastAsiaTheme="minorEastAsia" w:hAnsi="Cambria Math"/>
+                    </w:rPr>
+                    <m:t>F</m:t>
+                  </m:r>
+                  <m:ctrlPr>
+                    <w:rPr>
+                      <w:rFonts w:ascii="Cambria Math" w:eastAsiaTheme="minorEastAsia" w:hAnsi="Cambria Math"/>
+                      <w:i/>
+                    </w:rPr>
+                  </m:ctrlPr>
+                </m:num>
+                <m:den>
+                  <m:r>
+                    <w:rPr>
+                      <w:rFonts w:ascii="Cambria Math" w:eastAsiaTheme="minorEastAsia" w:hAnsi="Cambria Math"/>
+                    </w:rPr>
+                    <m:t>d</m:t>
+                  </m:r>
+                  <m:r>
+                    <m:rPr>
+                      <m:sty m:val="p"/>
+                    </m:rPr>
+                    <w:rPr>
+                      <w:rFonts w:ascii="Cambria Math" w:eastAsiaTheme="minorEastAsia" w:hAnsi="Cambria Math"/>
+                    </w:rPr>
+                    <m:t>α</m:t>
+                  </m:r>
+                  <m:ctrlPr>
+                    <w:rPr>
+                      <w:rFonts w:ascii="Cambria Math" w:eastAsiaTheme="minorEastAsia" w:hAnsi="Cambria Math"/>
+                      <w:i/>
+                    </w:rPr>
+                  </m:ctrlPr>
+                </m:den>
+              </m:f>
+              <m:r>
+                <m:rPr>
+                  <m:sty m:val="p"/>
+                </m:rPr>
+                <w:rPr>
+                  <w:rFonts w:ascii="Cambria Math" w:eastAsiaTheme="minorEastAsia" w:hAnsi="Cambria Math"/>
+                </w:rPr>
+                <m:t>⟺</m:t>
+              </m:r>
+              <m:f>
+                <m:fPr>
+                  <m:ctrlPr>
+                    <w:rPr>
+                      <w:rFonts w:ascii="Cambria Math" w:eastAsiaTheme="minorEastAsia" w:hAnsi="Cambria Math"/>
+                    </w:rPr>
+                  </m:ctrlPr>
+                </m:fPr>
+                <m:num>
+                  <m:r>
+                    <w:rPr>
+                      <w:rFonts w:ascii="Cambria Math" w:eastAsiaTheme="minorEastAsia" w:hAnsi="Cambria Math"/>
+                    </w:rPr>
+                    <m:t>d</m:t>
+                  </m:r>
+                  <m:r>
+                    <w:rPr>
+                      <w:rFonts w:ascii="Cambria Math" w:eastAsiaTheme="minorEastAsia" w:hAnsi="Cambria Math"/>
+                    </w:rPr>
+                    <m:t>L</m:t>
+                  </m:r>
+                  <m:ctrlPr>
+                    <w:rPr>
+                      <w:rFonts w:ascii="Cambria Math" w:eastAsiaTheme="minorEastAsia" w:hAnsi="Cambria Math"/>
+                      <w:i/>
+                    </w:rPr>
+                  </m:ctrlPr>
+                </m:num>
+                <m:den>
+                  <m:r>
+                    <w:rPr>
+                      <w:rFonts w:ascii="Cambria Math" w:eastAsiaTheme="minorEastAsia" w:hAnsi="Cambria Math"/>
+                    </w:rPr>
+                    <m:t>d</m:t>
+                  </m:r>
+                  <m:r>
+                    <m:rPr>
+                      <m:sty m:val="p"/>
+                    </m:rPr>
+                    <w:rPr>
+                      <w:rFonts w:ascii="Cambria Math" w:eastAsiaTheme="minorEastAsia" w:hAnsi="Cambria Math"/>
+                    </w:rPr>
+                    <m:t>α</m:t>
+                  </m:r>
+                  <m:ctrlPr>
+                    <w:rPr>
+                      <w:rFonts w:ascii="Cambria Math" w:eastAsiaTheme="minorEastAsia" w:hAnsi="Cambria Math"/>
+                      <w:i/>
+                    </w:rPr>
+                  </m:ctrlPr>
+                </m:den>
+              </m:f>
+              <m:r>
+                <w:rPr>
+                  <w:rFonts w:ascii="Cambria Math" w:eastAsiaTheme="minorEastAsia" w:hAnsi="Cambria Math"/>
+                </w:rPr>
+                <m:t>=</m:t>
+              </m:r>
+              <m:groupChr>
+                <m:groupChrPr>
+                  <m:ctrlPr>
+                    <w:rPr>
+                      <w:rFonts w:ascii="Cambria Math" w:eastAsiaTheme="minorEastAsia" w:hAnsi="Cambria Math"/>
+                    </w:rPr>
+                  </m:ctrlPr>
+                </m:groupChrPr>
+                <m:e>
+                  <m:r>
+                    <w:rPr>
+                      <w:rFonts w:ascii="Cambria Math" w:eastAsiaTheme="minorEastAsia" w:hAnsi="Cambria Math"/>
+                    </w:rPr>
+                    <m:t>2</m:t>
+                  </m:r>
+                  <m:d>
+                    <m:dPr>
+                      <m:ctrlPr>
+                        <w:rPr>
+                          <w:rFonts w:ascii="Cambria Math" w:eastAsiaTheme="minorEastAsia" w:hAnsi="Cambria Math"/>
+                          <w:i/>
+                        </w:rPr>
+                      </m:ctrlPr>
+                    </m:dPr>
+                    <m:e>
+                      <m:r>
+                        <m:rPr>
+                          <m:sty m:val="p"/>
+                        </m:rPr>
+                        <w:rPr>
+                          <w:rFonts w:ascii="Cambria Math" w:eastAsiaTheme="minorEastAsia" w:hAnsi="Cambria Math"/>
+                        </w:rPr>
+                        <m:t>μ</m:t>
+                      </m:r>
+                      <m:r>
+                        <w:rPr>
+                          <w:rFonts w:ascii="Cambria Math" w:eastAsiaTheme="minorEastAsia" w:hAnsi="Cambria Math"/>
+                        </w:rPr>
+                        <m:t>-</m:t>
+                      </m:r>
+                      <m:sSub>
+                        <m:sSubPr>
+                          <m:ctrlPr>
+                            <w:rPr>
+                              <w:rFonts w:ascii="Cambria Math" w:eastAsiaTheme="minorEastAsia" w:hAnsi="Cambria Math"/>
+                              <w:i/>
+                            </w:rPr>
+                          </m:ctrlPr>
+                        </m:sSubPr>
+                        <m:e>
+                          <m:r>
+                            <w:rPr>
+                              <w:rFonts w:ascii="Cambria Math" w:eastAsiaTheme="minorEastAsia" w:hAnsi="Cambria Math"/>
+                            </w:rPr>
+                            <m:t>v</m:t>
+                          </m:r>
+                        </m:e>
+                        <m:sub>
+                          <m:r>
+                            <w:rPr>
+                              <w:rFonts w:ascii="Cambria Math" w:eastAsiaTheme="minorEastAsia" w:hAnsi="Cambria Math"/>
+                            </w:rPr>
+                            <m:t>d</m:t>
+                          </m:r>
+                        </m:sub>
+                      </m:sSub>
+                    </m:e>
+                  </m:d>
+                  <m:f>
+                    <m:fPr>
+                      <m:ctrlPr>
+                        <w:rPr>
+                          <w:rFonts w:ascii="Cambria Math" w:eastAsiaTheme="minorEastAsia" w:hAnsi="Cambria Math"/>
+                        </w:rPr>
+                      </m:ctrlPr>
+                    </m:fPr>
+                    <m:num>
+                      <m:r>
+                        <w:rPr>
+                          <w:rFonts w:ascii="Cambria Math" w:eastAsiaTheme="minorEastAsia" w:hAnsi="Cambria Math"/>
+                        </w:rPr>
+                        <m:t>d</m:t>
+                      </m:r>
+                      <m:r>
+                        <m:rPr>
+                          <m:sty m:val="p"/>
+                        </m:rPr>
+                        <w:rPr>
+                          <w:rFonts w:ascii="Cambria Math" w:eastAsiaTheme="minorEastAsia" w:hAnsi="Cambria Math"/>
+                        </w:rPr>
+                        <m:t>μ</m:t>
+                      </m:r>
+                      <m:ctrlPr>
+                        <w:rPr>
+                          <w:rFonts w:ascii="Cambria Math" w:eastAsiaTheme="minorEastAsia" w:hAnsi="Cambria Math"/>
+                          <w:i/>
+                        </w:rPr>
+                      </m:ctrlPr>
+                    </m:num>
+                    <m:den>
+                      <m:r>
+                        <w:rPr>
+                          <w:rFonts w:ascii="Cambria Math" w:eastAsiaTheme="minorEastAsia" w:hAnsi="Cambria Math"/>
+                        </w:rPr>
+                        <m:t>d</m:t>
+                      </m:r>
+                      <m:r>
+                        <m:rPr>
+                          <m:sty m:val="p"/>
+                        </m:rPr>
+                        <w:rPr>
+                          <w:rFonts w:ascii="Cambria Math" w:eastAsiaTheme="minorEastAsia" w:hAnsi="Cambria Math"/>
+                        </w:rPr>
+                        <m:t>α</m:t>
+                      </m:r>
+                      <m:ctrlPr>
+                        <w:rPr>
+                          <w:rFonts w:ascii="Cambria Math" w:eastAsiaTheme="minorEastAsia" w:hAnsi="Cambria Math"/>
+                          <w:i/>
+                        </w:rPr>
+                      </m:ctrlPr>
+                    </m:den>
+                  </m:f>
+                </m:e>
+              </m:groupChr>
+              <m:groupChr>
+                <m:groupChrPr>
+                  <m:ctrlPr>
+                    <w:rPr>
+                      <w:rFonts w:ascii="Cambria Math" w:eastAsiaTheme="minorEastAsia" w:hAnsi="Cambria Math"/>
+                    </w:rPr>
+                  </m:ctrlPr>
+                </m:groupChrPr>
+                <m:e>
+                  <m:r>
+                    <w:rPr>
+                      <w:rFonts w:ascii="Cambria Math" w:eastAsiaTheme="minorEastAsia" w:hAnsi="Cambria Math"/>
+                    </w:rPr>
+                    <m:t xml:space="preserve">          </m:t>
+                  </m:r>
+                  <m:r>
+                    <w:rPr>
+                      <w:rFonts w:ascii="Cambria Math" w:eastAsiaTheme="minorEastAsia" w:hAnsi="Cambria Math"/>
+                    </w:rPr>
+                    <m:t>-</m:t>
+                  </m:r>
+                  <m:r>
+                    <w:rPr>
+                      <w:rFonts w:ascii="Cambria Math" w:eastAsiaTheme="minorEastAsia" w:hAnsi="Cambria Math"/>
+                    </w:rPr>
+                    <m:t>λ</m:t>
+                  </m:r>
+                  <m:f>
+                    <m:fPr>
+                      <m:ctrlPr>
+                        <w:rPr>
+                          <w:rFonts w:ascii="Cambria Math" w:eastAsiaTheme="minorEastAsia" w:hAnsi="Cambria Math"/>
+                        </w:rPr>
+                      </m:ctrlPr>
+                    </m:fPr>
+                    <m:num>
+                      <m:r>
+                        <w:rPr>
+                          <w:rFonts w:ascii="Cambria Math" w:eastAsiaTheme="minorEastAsia" w:hAnsi="Cambria Math"/>
+                        </w:rPr>
+                        <m:t>d</m:t>
+                      </m:r>
+                      <m:sSup>
+                        <m:sSupPr>
+                          <m:ctrlPr>
+                            <w:rPr>
+                              <w:rFonts w:ascii="Cambria Math" w:eastAsiaTheme="minorEastAsia" w:hAnsi="Cambria Math"/>
+                              <w:i/>
+                            </w:rPr>
+                          </m:ctrlPr>
+                        </m:sSupPr>
+                        <m:e>
+                          <m:r>
+                            <w:rPr>
+                              <w:rFonts w:ascii="Cambria Math" w:eastAsiaTheme="minorEastAsia" w:hAnsi="Cambria Math"/>
+                            </w:rPr>
+                            <m:t>s</m:t>
+                          </m:r>
+                        </m:e>
+                        <m:sup>
+                          <m:r>
+                            <w:rPr>
+                              <w:rFonts w:ascii="Cambria Math" w:eastAsiaTheme="minorEastAsia" w:hAnsi="Cambria Math"/>
+                            </w:rPr>
+                            <m:t>2</m:t>
+                          </m:r>
+                        </m:sup>
+                      </m:sSup>
+                      <m:ctrlPr>
+                        <w:rPr>
+                          <w:rFonts w:ascii="Cambria Math" w:eastAsiaTheme="minorEastAsia" w:hAnsi="Cambria Math"/>
+                          <w:i/>
+                        </w:rPr>
+                      </m:ctrlPr>
+                    </m:num>
+                    <m:den>
+                      <m:r>
+                        <w:rPr>
+                          <w:rFonts w:ascii="Cambria Math" w:eastAsiaTheme="minorEastAsia" w:hAnsi="Cambria Math"/>
+                        </w:rPr>
+                        <m:t>d</m:t>
+                      </m:r>
+                      <m:r>
+                        <m:rPr>
+                          <m:sty m:val="p"/>
+                        </m:rPr>
+                        <w:rPr>
+                          <w:rFonts w:ascii="Cambria Math" w:eastAsiaTheme="minorEastAsia" w:hAnsi="Cambria Math"/>
+                        </w:rPr>
+                        <m:t>α</m:t>
+                      </m:r>
+                      <m:ctrlPr>
+                        <w:rPr>
+                          <w:rFonts w:ascii="Cambria Math" w:eastAsiaTheme="minorEastAsia" w:hAnsi="Cambria Math"/>
+                          <w:i/>
+                        </w:rPr>
+                      </m:ctrlPr>
+                    </m:den>
+                  </m:f>
+                </m:e>
+              </m:groupChr>
+            </m:e>
+          </m:borderBox>
+        </m:oMath>
+      </m:oMathPara>
+    </w:p>
+    <w:p>
+      <w:pPr>
+        <w:pStyle w:val="BodyText"/>
+        <w:jc w:val="center"/>
+        <w:rPr>
+          <w:rFonts w:eastAsiaTheme="minorEastAsia"/>
+        </w:rPr>
+      </w:pPr>
+      <m:oMath>
+        <m:r>
+          <m:rPr>
+            <m:nor/>
+          </m:rPr>
+          <w:rPr>
+            <w:rFonts w:ascii="Cambria Math" w:eastAsiaTheme="minorEastAsia" w:hAnsi="Cambria Math"/>
+          </w:rPr>
+          <m:t>deterministic (</m:t>
+        </m:r>
+        <m:r>
+          <m:rPr>
+            <m:nor/>
+          </m:rPr>
+          <w:rPr>
+            <w:rFonts w:ascii="Cambria Math" w:eastAsiaTheme="minorEastAsia" w:hAnsi="Cambria Math"/>
+          </w:rPr>
+          <m:t xml:space="preserve">internal </m:t>
+        </m:r>
+        <m:r>
+          <m:rPr>
+            <m:nor/>
+          </m:rPr>
+          <w:rPr>
+            <w:rFonts w:ascii="Cambria Math" w:eastAsiaTheme="minorEastAsia" w:hAnsi="Cambria Math"/>
+          </w:rPr>
+          <m:t>energy)</m:t>
+        </m:r>
+      </m:oMath>
+      <w:r>
+        <w:rPr>
+          <w:rFonts w:eastAsiaTheme="minorEastAsia"/>
+        </w:rPr>
+        <w:t xml:space="preserve">         </w:t>
+      </w:r>
+      <m:oMath>
+        <m:r>
+          <m:rPr>
+            <m:nor/>
+          </m:rPr>
+          <w:rPr>
+            <w:rFonts w:ascii="Cambria Math" w:eastAsiaTheme="minorEastAsia" w:hAnsi="Cambria Math"/>
+          </w:rPr>
+          <m:t xml:space="preserve">entropic </m:t>
+        </m:r>
+        <m:r>
+          <m:rPr>
+            <m:nor/>
+          </m:rPr>
+          <w:rPr>
+            <w:rFonts w:ascii="Cambria Math" w:eastAsiaTheme="minorEastAsia" w:hAnsi="Cambria Math"/>
+          </w:rPr>
+          <m:t>heat</m:t>
+        </m:r>
+        <m:r>
+          <m:rPr>
+            <m:nor/>
+          </m:rPr>
+          <w:rPr>
+            <w:rFonts w:ascii="Cambria Math" w:eastAsiaTheme="minorEastAsia" w:hAnsi="Cambria Math"/>
+          </w:rPr>
+          <m:t xml:space="preserve"> </m:t>
+        </m:r>
+      </m:oMath>
+    </w:p>
+    <w:p>
+      <w:pPr>
+        <w:pStyle w:val="BodyText"/>
+        <w:jc w:val="center"/>
+        <w:rPr>
+          <w:rFonts w:eastAsiaTheme="minorEastAsia"/>
+        </w:rPr>
+      </w:pPr>
+      <m:oMathPara>
+        <m:oMath>
+          <m:borderBox>
+            <m:borderBoxPr>
+              <m:ctrlPr>
+                <w:rPr>
+                  <w:rFonts w:ascii="Cambria Math" w:eastAsiaTheme="minorEastAsia" w:hAnsi="Cambria Math"/>
+                  <w:i/>
+                </w:rPr>
+              </m:ctrlPr>
+            </m:borderBoxPr>
+            <m:e>
+              <m:f>
+                <m:fPr>
+                  <m:ctrlPr>
+                    <w:rPr>
+                      <w:rFonts w:ascii="Cambria Math" w:eastAsiaTheme="minorEastAsia" w:hAnsi="Cambria Math"/>
+                    </w:rPr>
+                  </m:ctrlPr>
+                </m:fPr>
+                <m:num>
+                  <m:r>
+                    <w:rPr>
+                      <w:rFonts w:ascii="Cambria Math" w:eastAsiaTheme="minorEastAsia" w:hAnsi="Cambria Math"/>
+                    </w:rPr>
+                    <m:t>d</m:t>
+                  </m:r>
+                  <m:r>
+                    <w:rPr>
+                      <w:rFonts w:ascii="Cambria Math" w:eastAsiaTheme="minorEastAsia" w:hAnsi="Cambria Math"/>
+                    </w:rPr>
+                    <m:t>F</m:t>
+                  </m:r>
+                  <m:ctrlPr>
+                    <w:rPr>
+                      <w:rFonts w:ascii="Cambria Math" w:eastAsiaTheme="minorEastAsia" w:hAnsi="Cambria Math"/>
+                      <w:i/>
+                    </w:rPr>
+                  </m:ctrlPr>
+                </m:num>
+                <m:den>
+                  <m:r>
+                    <w:rPr>
+                      <w:rFonts w:ascii="Cambria Math" w:eastAsiaTheme="minorEastAsia" w:hAnsi="Cambria Math"/>
+                    </w:rPr>
+                    <m:t>d</m:t>
+                  </m:r>
+                  <m:r>
+                    <m:rPr>
+                      <m:sty m:val="p"/>
+                    </m:rPr>
+                    <w:rPr>
+                      <w:rFonts w:ascii="Cambria Math" w:eastAsiaTheme="minorEastAsia" w:hAnsi="Cambria Math"/>
+                    </w:rPr>
+                    <m:t>α</m:t>
+                  </m:r>
+                  <m:ctrlPr>
+                    <w:rPr>
+                      <w:rFonts w:ascii="Cambria Math" w:eastAsiaTheme="minorEastAsia" w:hAnsi="Cambria Math"/>
+                      <w:i/>
+                    </w:rPr>
+                  </m:ctrlPr>
+                </m:den>
+              </m:f>
+              <m:r>
+                <w:rPr>
+                  <w:rFonts w:ascii="Cambria Math" w:eastAsiaTheme="minorEastAsia" w:hAnsi="Cambria Math"/>
+                </w:rPr>
+                <m:t>=</m:t>
+              </m:r>
+              <m:f>
+                <m:fPr>
+                  <m:ctrlPr>
+                    <w:rPr>
+                      <w:rFonts w:ascii="Cambria Math" w:eastAsiaTheme="minorEastAsia" w:hAnsi="Cambria Math"/>
+                    </w:rPr>
+                  </m:ctrlPr>
+                </m:fPr>
+                <m:num>
+                  <m:r>
+                    <w:rPr>
+                      <w:rFonts w:ascii="Cambria Math" w:eastAsiaTheme="minorEastAsia" w:hAnsi="Cambria Math"/>
+                    </w:rPr>
+                    <m:t>d</m:t>
+                  </m:r>
+                  <m:r>
+                    <w:rPr>
+                      <w:rFonts w:ascii="Cambria Math" w:eastAsiaTheme="minorEastAsia" w:hAnsi="Cambria Math"/>
+                    </w:rPr>
+                    <m:t>U</m:t>
+                  </m:r>
+                  <m:ctrlPr>
+                    <w:rPr>
+                      <w:rFonts w:ascii="Cambria Math" w:eastAsiaTheme="minorEastAsia" w:hAnsi="Cambria Math"/>
+                      <w:i/>
+                    </w:rPr>
+                  </m:ctrlPr>
+                </m:num>
+                <m:den>
+                  <m:r>
+                    <w:rPr>
+                      <w:rFonts w:ascii="Cambria Math" w:eastAsiaTheme="minorEastAsia" w:hAnsi="Cambria Math"/>
+                    </w:rPr>
+                    <m:t>d</m:t>
+                  </m:r>
+                  <m:r>
+                    <m:rPr>
+                      <m:sty m:val="p"/>
+                    </m:rPr>
+                    <w:rPr>
+                      <w:rFonts w:ascii="Cambria Math" w:eastAsiaTheme="minorEastAsia" w:hAnsi="Cambria Math"/>
+                    </w:rPr>
+                    <m:t>α</m:t>
+                  </m:r>
+                  <m:ctrlPr>
+                    <w:rPr>
+                      <w:rFonts w:ascii="Cambria Math" w:eastAsiaTheme="minorEastAsia" w:hAnsi="Cambria Math"/>
+                      <w:i/>
+                    </w:rPr>
+                  </m:ctrlPr>
+                </m:den>
+              </m:f>
+              <m:r>
+                <w:rPr>
+                  <w:rFonts w:ascii="Cambria Math" w:eastAsiaTheme="minorEastAsia" w:hAnsi="Cambria Math"/>
+                </w:rPr>
+                <m:t xml:space="preserve">                              -</m:t>
+              </m:r>
+              <m:sSub>
+                <m:sSubPr>
+                  <m:ctrlPr>
+                    <w:rPr>
+                      <w:rFonts w:ascii="Cambria Math" w:eastAsiaTheme="minorEastAsia" w:hAnsi="Cambria Math"/>
+                      <w:i/>
+                    </w:rPr>
+                  </m:ctrlPr>
+                </m:sSubPr>
+                <m:e>
+                  <m:r>
+                    <w:rPr>
+                      <w:rFonts w:ascii="Cambria Math" w:eastAsiaTheme="minorEastAsia" w:hAnsi="Cambria Math"/>
+                    </w:rPr>
+                    <m:t>T</m:t>
+                  </m:r>
+                </m:e>
+                <m:sub>
+                  <m:r>
+                    <m:rPr>
+                      <m:nor/>
+                    </m:rPr>
+                    <w:rPr>
+                      <w:rFonts w:ascii="Cambria Math" w:eastAsiaTheme="minorEastAsia" w:hAnsi="Cambria Math"/>
+                    </w:rPr>
+                    <m:t>eff</m:t>
+                  </m:r>
+                </m:sub>
+              </m:sSub>
+              <m:f>
+                <m:fPr>
+                  <m:ctrlPr>
+                    <w:rPr>
+                      <w:rFonts w:ascii="Cambria Math" w:eastAsiaTheme="minorEastAsia" w:hAnsi="Cambria Math"/>
+                    </w:rPr>
+                  </m:ctrlPr>
+                </m:fPr>
+                <m:num>
+                  <m:r>
+                    <w:rPr>
+                      <w:rFonts w:ascii="Cambria Math" w:eastAsiaTheme="minorEastAsia" w:hAnsi="Cambria Math"/>
+                    </w:rPr>
+                    <m:t>d</m:t>
+                  </m:r>
+                  <m:sSub>
+                    <m:sSubPr>
+                      <m:ctrlPr>
+                        <w:rPr>
+                          <w:rFonts w:ascii="Cambria Math" w:eastAsiaTheme="minorEastAsia" w:hAnsi="Cambria Math"/>
+                          <w:i/>
+                        </w:rPr>
+                      </m:ctrlPr>
+                    </m:sSubPr>
+                    <m:e>
+                      <m:r>
+                        <w:rPr>
+                          <w:rFonts w:ascii="Cambria Math" w:eastAsiaTheme="minorEastAsia" w:hAnsi="Cambria Math"/>
+                        </w:rPr>
+                        <m:t>S</m:t>
+                      </m:r>
+                    </m:e>
+                    <m:sub>
+                      <m:r>
+                        <m:rPr>
+                          <m:nor/>
+                        </m:rPr>
+                        <w:rPr>
+                          <w:rFonts w:ascii="Cambria Math" w:eastAsiaTheme="minorEastAsia" w:hAnsi="Cambria Math"/>
+                        </w:rPr>
+                        <m:t>entropy</m:t>
+                      </m:r>
+                    </m:sub>
+                  </m:sSub>
+                  <m:ctrlPr>
+                    <w:rPr>
+                      <w:rFonts w:ascii="Cambria Math" w:eastAsiaTheme="minorEastAsia" w:hAnsi="Cambria Math"/>
+                      <w:i/>
+                    </w:rPr>
+                  </m:ctrlPr>
+                </m:num>
+                <m:den>
+                  <m:r>
+                    <w:rPr>
+                      <w:rFonts w:ascii="Cambria Math" w:eastAsiaTheme="minorEastAsia" w:hAnsi="Cambria Math"/>
+                    </w:rPr>
+                    <m:t>d</m:t>
+                  </m:r>
+                  <m:r>
+                    <m:rPr>
+                      <m:sty m:val="p"/>
+                    </m:rPr>
+                    <w:rPr>
+                      <w:rFonts w:ascii="Cambria Math" w:eastAsiaTheme="minorEastAsia" w:hAnsi="Cambria Math"/>
+                    </w:rPr>
+                    <m:t>α</m:t>
+                  </m:r>
+                  <m:ctrlPr>
+                    <w:rPr>
+                      <w:rFonts w:ascii="Cambria Math" w:eastAsiaTheme="minorEastAsia" w:hAnsi="Cambria Math"/>
+                      <w:i/>
+                    </w:rPr>
+                  </m:ctrlPr>
+                </m:den>
+              </m:f>
+            </m:e>
+          </m:borderBox>
+        </m:oMath>
+      </m:oMathPara>
+    </w:p>
+    <w:p>
+      <w:pPr>
+        <w:pStyle w:val="BodyText"/>
+        <w:jc w:val="center"/>
+        <w:rPr>
+          <w:rFonts w:eastAsiaTheme="minorEastAsia"/>
+        </w:rPr>
+      </w:pPr>
+    </w:p>
+    <w:p>
+      <w:pPr>
         <w:pStyle w:val="Abstract"/>
       </w:pPr>
       <w:bookmarkStart w:id="1" w:name="varianceslope-coupled-learning-rate"/>
@@ -20,43 +1222,7 @@
         <w:rPr>
           <w:highlight w:val="yellow"/>
         </w:rPr>
-        <w:t>DON’T FORGET THE ALPHA WINDOW SECTION OF THE ALGORITH IN SECTION 1. UNDER “</w:t>
-      </w:r>
-      <w:r>
-        <w:rPr>
-          <w:highlight w:val="yellow"/>
-        </w:rPr>
-        <w:t>Polyak–Ruppert Slope Estimation</w:t>
-      </w:r>
-      <w:r>
-        <w:rPr>
-          <w:highlight w:val="yellow"/>
-        </w:rPr>
-        <w:t xml:space="preserve">” OF </w:t>
-      </w:r>
-      <w:r>
-        <w:rPr>
-          <w:highlight w:val="yellow"/>
-        </w:rPr>
-        <w:t>“Loss Function and Residual Explanation and Minimization.md”</w:t>
-      </w:r>
-      <w:r>
-        <w:rPr>
-          <w:highlight w:val="yellow"/>
-        </w:rPr>
-        <w:t xml:space="preserve"> AND UNDER “</w:t>
-      </w:r>
-      <w:r>
-        <w:rPr>
-          <w:highlight w:val="yellow"/>
-        </w:rPr>
-        <w:t>The training loop, step-by-step</w:t>
-      </w:r>
-      <w:r>
-        <w:rPr>
-          <w:highlight w:val="yellow"/>
-        </w:rPr>
-        <w:t>” WITHIN “Readme.md”.</w:t>
+        <w:t>DON’T FORGET THE ALPHA WINDOW SECTION OF THE ALGORITH IN SECTION 1. UNDER “Polyak–Ruppert Slope Estimation” OF “Loss Function and Residual Explanation and Minimization.md” AND UNDER “The training loop, step-by-step” WITHIN “Readme.md”.</w:t>
       </w:r>
     </w:p>
     <w:p>
@@ -465,7 +1631,7 @@
     <w:p>
       <w:r>
         <w:pict w14:anchorId="0A92587E">
-          <v:rect id="_x0000_i1025" style="width:0;height:1.5pt" o:hralign="center" o:hrstd="t" o:hr="t"/>
+          <v:rect id="_x0000_i1061" style="width:0;height:1.5pt" o:hralign="center" o:hrstd="t" o:hr="t"/>
         </w:pict>
       </w:r>
     </w:p>
@@ -512,19 +1678,7 @@
         <w:rPr>
           <w:highlight w:val="yellow"/>
         </w:rPr>
-        <w:t>USE THE NOTES FROM SECTION 1. IN “</w:t>
-      </w:r>
-      <w:r>
-        <w:rPr>
-          <w:highlight w:val="yellow"/>
-        </w:rPr>
-        <w:t>Loss Function and Residual Explanation and Minimization.md</w:t>
-      </w:r>
-      <w:r>
-        <w:rPr>
-          <w:highlight w:val="yellow"/>
-        </w:rPr>
-        <w:t>” to explain the P-R averaging of m.</w:t>
+        <w:t>USE THE NOTES FROM SECTION 1. IN “Loss Function and Residual Explanation and Minimization.md” to explain the P-R averaging of m.</w:t>
       </w:r>
     </w:p>
     <w:p>
@@ -584,13 +1738,7 @@
                 <w:rPr>
                   <w:rFonts w:ascii="Cambria Math" w:hAnsi="Cambria Math"/>
                 </w:rPr>
-                <m:t>d</m:t>
-              </m:r>
-              <m:r>
-                <w:rPr>
-                  <w:rFonts w:ascii="Cambria Math" w:hAnsi="Cambria Math"/>
-                </w:rPr>
-                <m:t>μ</m:t>
+                <m:t>dμ</m:t>
               </m:r>
               <m:ctrlPr>
                 <w:rPr>
@@ -604,13 +1752,7 @@
                 <w:rPr>
                   <w:rFonts w:ascii="Cambria Math" w:hAnsi="Cambria Math"/>
                 </w:rPr>
-                <m:t>d</m:t>
-              </m:r>
-              <m:r>
-                <w:rPr>
-                  <w:rFonts w:ascii="Cambria Math" w:hAnsi="Cambria Math"/>
-                </w:rPr>
-                <m:t>α</m:t>
+                <m:t>dα</m:t>
               </m:r>
               <m:ctrlPr>
                 <w:rPr>
@@ -628,13 +1770,14 @@
         <w:pStyle w:val="FirstParagraph"/>
       </w:pPr>
       <w:r>
+        <w:lastRenderedPageBreak/>
         <w:t>This slope governs both the direction and magnitude of updates, transforming PR averaging into a real-time geometric controller rather than a post hoc smoother.</w:t>
       </w:r>
     </w:p>
     <w:p>
       <w:r>
         <w:pict w14:anchorId="2B59938B">
-          <v:rect id="_x0000_i1026" style="width:0;height:1.5pt" o:hralign="center" o:hrstd="t" o:hr="t"/>
+          <v:rect id="_x0000_i1062" style="width:0;height:1.5pt" o:hralign="center" o:hrstd="t" o:hr="t"/>
         </w:pict>
       </w:r>
     </w:p>
@@ -678,19 +1821,7 @@
         <w:rPr>
           <w:highlight w:val="yellow"/>
         </w:rPr>
-        <w:t xml:space="preserve">USE NOTES FROM SECTION 3. IN </w:t>
-      </w:r>
-      <w:r>
-        <w:rPr>
-          <w:highlight w:val="yellow"/>
-        </w:rPr>
-        <w:t xml:space="preserve">“Loss Function and Residual Explanation and Minimization.md” to explain the </w:t>
-      </w:r>
-      <w:r>
-        <w:rPr>
-          <w:highlight w:val="yellow"/>
-        </w:rPr>
-        <w:t xml:space="preserve">centered residual </w:t>
+        <w:t xml:space="preserve">USE NOTES FROM SECTION 3. IN “Loss Function and Residual Explanation and Minimization.md” to explain the centered residual </w:t>
       </w:r>
       <w:r>
         <w:rPr>
@@ -802,13 +1933,7 @@
             <w:rPr>
               <w:rFonts w:ascii="Cambria Math" w:hAnsi="Cambria Math"/>
             </w:rPr>
-            <m:t>window_coeficient</m:t>
-          </m:r>
-          <m:r>
-            <w:rPr>
-              <w:rFonts w:ascii="Cambria Math" w:hAnsi="Cambria Math"/>
-            </w:rPr>
-            <m:t>∙</m:t>
+            <m:t>window_coeficient∙</m:t>
           </m:r>
           <m:f>
             <m:fPr>
@@ -913,13 +2038,7 @@
         <w:rPr>
           <w:highlight w:val="yellow"/>
         </w:rPr>
-        <w:t>W</w:t>
-      </w:r>
-      <w:r>
-        <w:rPr>
-          <w:highlight w:val="yellow"/>
-        </w:rPr>
-        <w:t xml:space="preserve">hen the mean equation within the alpha window is linear enough for the </w:t>
+        <w:t xml:space="preserve">When the mean equation within the alpha window is linear enough for the </w:t>
       </w:r>
       <w:r>
         <w:rPr>
@@ -937,7 +2056,6 @@
         <w:rPr>
           <w:highlight w:val="yellow"/>
         </w:rPr>
-        <w:lastRenderedPageBreak/>
         <w:t xml:space="preserve">the secant to still pass as linear, ( </w:t>
       </w:r>
       <m:oMath>
@@ -1089,13 +2207,7 @@
         <w:rPr>
           <w:highlight w:val="yellow"/>
         </w:rPr>
-        <w:t xml:space="preserve"> window</w:t>
-      </w:r>
-      <w:r>
-        <w:rPr>
-          <w:highlight w:val="yellow"/>
-        </w:rPr>
-        <w:t xml:space="preserve">. This signals that </w:t>
+        <w:t xml:space="preserve"> window. This signals that </w:t>
       </w:r>
       <w:r>
         <w:rPr>
@@ -1105,7 +2217,7 @@
       </w:r>
       <w:r>
         <w:pict w14:anchorId="267E170F">
-          <v:rect id="_x0000_i1027" style="width:0;height:1.5pt" o:hralign="center" o:hrstd="t" o:hr="t"/>
+          <v:rect id="_x0000_i1063" style="width:0;height:1.5pt" o:hralign="center" o:hrstd="t" o:hr="t"/>
         </w:pict>
       </w:r>
     </w:p>
@@ -1396,7 +2508,7 @@
     <w:p>
       <w:r>
         <w:pict w14:anchorId="4E4772F0">
-          <v:rect id="_x0000_i1028" style="width:0;height:1.5pt" o:hralign="center" o:hrstd="t" o:hr="t"/>
+          <v:rect id="_x0000_i1064" style="width:0;height:1.5pt" o:hralign="center" o:hrstd="t" o:hr="t"/>
         </w:pict>
       </w:r>
     </w:p>
@@ -1422,19 +2534,7 @@
         <w:rPr>
           <w:highlight w:val="yellow"/>
         </w:rPr>
-        <w:t xml:space="preserve">THESE NOTES FOR PHASE TRANSITION AND RECURSIVE STABILITY ARE LOCATED IN SECTION 6. IN </w:t>
-      </w:r>
-      <w:r>
-        <w:rPr>
-          <w:highlight w:val="yellow"/>
-        </w:rPr>
-        <w:t xml:space="preserve">“Loss Function and Residual Explanation and Minimization.md” to explain </w:t>
-      </w:r>
-      <w:r>
-        <w:rPr>
-          <w:highlight w:val="yellow"/>
-        </w:rPr>
-        <w:t xml:space="preserve">how stability is empirically derived </w:t>
+        <w:t xml:space="preserve">THESE NOTES FOR PHASE TRANSITION AND RECURSIVE STABILITY ARE LOCATED IN SECTION 6. IN “Loss Function and Residual Explanation and Minimization.md” to explain how stability is empirically derived </w:t>
       </w:r>
       <w:r>
         <w:rPr>
@@ -1446,19 +2546,7 @@
         <w:rPr>
           <w:highlight w:val="yellow"/>
         </w:rPr>
-        <w:t>and not assumed. Also include notes on linear approximation in non-linear regions from section 3. in “</w:t>
-      </w:r>
-      <w:r>
-        <w:rPr>
-          <w:highlight w:val="yellow"/>
-        </w:rPr>
-        <w:t>Fold Change Drift Velocity.md</w:t>
-      </w:r>
-      <w:r>
-        <w:rPr>
-          <w:highlight w:val="yellow"/>
-        </w:rPr>
-        <w:t>”</w:t>
+        <w:t>and not assumed. Also include notes on linear approximation in non-linear regions from section 3. in “Fold Change Drift Velocity.md”</w:t>
       </w:r>
     </w:p>
     <w:p>
@@ -1480,6 +2568,7 @@
         </w:rPr>
       </w:pPr>
       <w:r>
+        <w:lastRenderedPageBreak/>
         <w:t xml:space="preserve"> </w:t>
       </w:r>
       <m:oMath>
@@ -1529,13 +2618,7 @@
               <w:rPr>
                 <w:rFonts w:ascii="Cambria Math" w:hAnsi="Cambria Math"/>
               </w:rPr>
-              <m:t>1-2</m:t>
-            </m:r>
-            <m:r>
-              <w:rPr>
-                <w:rFonts w:ascii="Cambria Math" w:hAnsi="Cambria Math"/>
-              </w:rPr>
-              <m:t>γ</m:t>
+              <m:t>1-2γ</m:t>
             </m:r>
             <m:sSubSup>
               <m:sSubSupPr>
@@ -1603,19 +2686,7 @@
           <w:rPr>
             <w:rFonts w:ascii="Cambria Math" w:hAnsi="Cambria Math"/>
           </w:rPr>
-          <m:t>+</m:t>
-        </m:r>
-        <m:r>
-          <w:rPr>
-            <w:rFonts w:ascii="Cambria Math" w:hAnsi="Cambria Math"/>
-          </w:rPr>
-          <m:t>γ</m:t>
-        </m:r>
-        <m:r>
-          <w:rPr>
-            <w:rFonts w:ascii="Cambria Math" w:hAnsi="Cambria Math"/>
-          </w:rPr>
-          <m:t>∙</m:t>
+          <m:t>+γ∙</m:t>
         </m:r>
         <m:r>
           <m:rPr>
@@ -1752,31 +2823,7 @@
         <w:rPr>
           <w:highlight w:val="yellow"/>
         </w:rPr>
-        <w:t xml:space="preserve">THE NOTES FOR THE </w:t>
-      </w:r>
-      <w:r>
-        <w:rPr>
-          <w:highlight w:val="yellow"/>
-        </w:rPr>
-        <w:t>standard error noise dominant check</w:t>
-      </w:r>
-      <w:r>
-        <w:rPr>
-          <w:highlight w:val="yellow"/>
-        </w:rPr>
-        <w:t xml:space="preserve"> IS IN SECTION 2. AND 3. OF </w:t>
-      </w:r>
-      <w:r>
-        <w:rPr>
-          <w:highlight w:val="yellow"/>
-        </w:rPr>
-        <w:t>“Loss Function and Residual Explanation and Minimization.md”</w:t>
-      </w:r>
-      <w:r>
-        <w:rPr>
-          <w:highlight w:val="yellow"/>
-        </w:rPr>
-        <w:t xml:space="preserve"> TO EXPLAIN HOW THE PROGRAM DYNAMICALLY PHASE TRANSITIONS.</w:t>
+        <w:t>THE NOTES FOR THE standard error noise dominant check IS IN SECTION 2. AND 3. OF “Loss Function and Residual Explanation and Minimization.md” TO EXPLAIN HOW THE PROGRAM DYNAMICALLY PHASE TRANSITIONS.</w:t>
       </w:r>
     </w:p>
     <w:p>
@@ -2323,25 +3370,7 @@
         <w:rPr>
           <w:highlight w:val="yellow"/>
         </w:rPr>
-        <w:t xml:space="preserve">Robbins–Monro </w:t>
-      </w:r>
-      <w:r>
-        <w:rPr>
-          <w:highlight w:val="yellow"/>
-        </w:rPr>
-        <w:t xml:space="preserve">like </w:t>
-      </w:r>
-      <w:r>
-        <w:rPr>
-          <w:highlight w:val="yellow"/>
-        </w:rPr>
-        <w:t>decay phase</w:t>
-      </w:r>
-      <w:r>
-        <w:rPr>
-          <w:highlight w:val="yellow"/>
-        </w:rPr>
-        <w:t xml:space="preserve"> but for populations of data instead of </w:t>
+        <w:t xml:space="preserve">Robbins–Monro like decay phase but for populations of data instead of </w:t>
       </w:r>
       <w:r>
         <w:rPr>
@@ -2359,13 +3388,7 @@
         <w:rPr>
           <w:highlight w:val="yellow"/>
         </w:rPr>
-        <w:t>B</w:t>
-      </w:r>
-      <w:r>
-        <w:rPr>
-          <w:highlight w:val="yellow"/>
-        </w:rPr>
-        <w:t xml:space="preserve">ecause both </w:t>
+        <w:t xml:space="preserve">Because both </w:t>
       </w:r>
       <m:oMath>
         <m:sSub>
@@ -3014,6 +4037,7 @@
   <w:style w:type="character" w:default="1" w:styleId="DefaultParagraphFont">
     <w:name w:val="Default Paragraph Font"/>
     <w:uiPriority w:val="1"/>
+    <w:semiHidden/>
     <w:unhideWhenUsed/>
   </w:style>
   <w:style w:type="table" w:default="1" w:styleId="TableNormal">

</xml_diff>